<commit_message>
file renamed, date base redirect
</commit_message>
<xml_diff>
--- a/job-letter/job-letter.docx
+++ b/job-letter/job-letter.docx
@@ -243,7 +243,7 @@
         <w:rPr>
           <w:rtl w:val="0"/>
         </w:rPr>
-        <w:t xml:space="preserve">[Date]</w:t>
+        <w:t xml:space="preserve">[5th March 2026]</w:t>
       </w:r>
     </w:p>
     <w:p>
@@ -318,7 +318,7 @@
         <w:rPr>
           <w:rtl w:val="0"/>
         </w:rPr>
-        <w:t xml:space="preserve">[Company Location]</w:t>
+        <w:t xml:space="preserve">[7400 Jessore IT Park Level 10 </w:t>
       </w:r>
     </w:p>
     <w:p>
@@ -339,6 +339,27 @@
         <w:rPr>
           <w:rtl w:val="0"/>
         </w:rPr>
+        <w:t xml:space="preserve">Jashore Bangladesh]</w:t>
+      </w:r>
+    </w:p>
+    <w:p>
+      <w:pPr>
+        <w:pageBreakBefore w:val="0"/>
+        <w:pBdr>
+          <w:top w:space="0" w:sz="0" w:val="nil"/>
+          <w:left w:space="0" w:sz="0" w:val="nil"/>
+          <w:bottom w:space="0" w:sz="0" w:val="nil"/>
+          <w:right w:space="0" w:sz="0" w:val="nil"/>
+          <w:between w:space="0" w:sz="0" w:val="nil"/>
+        </w:pBdr>
+        <w:shd w:fill="auto" w:val="clear"/>
+        <w:spacing w:before="0" w:line="240" w:lineRule="auto"/>
+        <w:rPr/>
+      </w:pPr>
+      <w:r>
+        <w:rPr>
+          <w:rtl w:val="0"/>
+        </w:rPr>
       </w:r>
     </w:p>
     <w:p>
@@ -357,7 +378,7 @@
         <w:rPr>
           <w:rtl w:val="0"/>
         </w:rPr>
-        <w:t xml:space="preserve">: Application for Front-End Developer Role – Hassan Biswas</w:t>
+        <w:t xml:space="preserve">: Application for Junior Front-End Developer Role – Hassan Biswas</w:t>
       </w:r>
     </w:p>
     <w:p>
@@ -387,7 +408,7 @@
           <w:bCs w:val="1"/>
           <w:rtl w:val="0"/>
         </w:rPr>
-        <w:t xml:space="preserve">Front-End Developer</w:t>
+        <w:t xml:space="preserve">Junior Front-End Developer</w:t>
       </w:r>
       <w:r>
         <w:rPr>
@@ -789,7 +810,7 @@
         <wp:inline distB="114300" distT="114300" distL="114300" distR="114300">
           <wp:extent cx="5943600" cy="63500"/>
           <wp:effectExtent b="0" l="0" r="0" t="0"/>
-          <wp:docPr descr="horizontal line" id="3" name="image1.png"/>
+          <wp:docPr descr="horizontal line" id="1" name="image1.png"/>
           <a:graphic>
             <a:graphicData uri="http://schemas.openxmlformats.org/drawingml/2006/picture">
               <pic:pic>
@@ -867,7 +888,7 @@
         <wp:inline distB="114300" distT="114300" distL="114300" distR="114300">
           <wp:extent cx="5943600" cy="63500"/>
           <wp:effectExtent b="0" l="0" r="0" t="0"/>
-          <wp:docPr descr="horizontal line" id="4" name="image1.png"/>
+          <wp:docPr descr="horizontal line" id="2" name="image1.png"/>
           <a:graphic>
             <a:graphicData uri="http://schemas.openxmlformats.org/drawingml/2006/picture">
               <pic:pic>
@@ -1176,20 +1197,6 @@
       <w:sz w:val="48"/>
       <w:szCs w:val="48"/>
     </w:rPr>
-  </w:style>
-  <w:style w:type="table" w:styleId="TableNormal" w:default="1">
-    <w:name w:val="TableNormal"/>
-    <w:tblPr>
-      <w:tblCellMar>
-        <w:top w:w="100.0" w:type="dxa"/>
-        <w:left w:w="100.0" w:type="dxa"/>
-        <w:bottom w:w="100.0" w:type="dxa"/>
-        <w:right w:w="100.0" w:type="dxa"/>
-      </w:tblCellMar>
-    </w:tblPr>
-  </w:style>
-  <w:style w:type="paragraph" w:styleId="Normal" w:default="1">
-    <w:name w:val="normal"/>
   </w:style>
   <w:style w:type="paragraph" w:styleId="Subtitle">
     <w:name w:val="Subtitle"/>
@@ -1531,7 +1538,7 @@
 
 <file path=customXML/item1.xml><?xml version="1.0" encoding="utf-8"?>
 <go:gDocsCustomXmlDataStorage xmlns:go="http://customooxmlschemas.google.com/" xmlns:r="http://schemas.openxmlformats.org/officeDocument/2006/relationships" uri="GoogleDocsCustomDataVersion2">
-  <go:docsCustomData xmlns:go="http://customooxmlschemas.google.com/" roundtripDataSignature="AMtx7mhicW1nCd7vRE5f5A+MimpjS3grvQ==">CgMxLjA4AHIhMXpnV2F2UWFhTVlya2oxZVNfTnJSS2dTeW42dzJaenc5</go:docsCustomData>
+  <go:docsCustomData xmlns:go="http://customooxmlschemas.google.com/" roundtripDataSignature="AMtx7mj6EjLK6aTvWU8wN4eUCvO9qcg8nQ==">CgMxLjA4AHIhMXREUzB1bC0yd0J1M242RGFLSmZhd3dnQ2pSU3NrTmt5</go:docsCustomData>
 </go:gDocsCustomXmlDataStorage>
 </file>
 

</xml_diff>